<commit_message>
minor fixes, alomst final (a presentation will probably be added later
</commit_message>
<xml_diff>
--- a/lab4_report.docx
+++ b/lab4_report.docx
@@ -20,7 +20,29 @@
           <w:szCs w:val="32"/>
           <w:lang w:val="ru-RU"/>
         </w:rPr>
-        <w:t>Соколовский Ян</w:t>
+        <w:t xml:space="preserve">Соколовский Ян, 2 курс, 7 группа </w:t>
+      </w:r>
+    </w:p>
+    <w:p>
+      <w:pPr>
+        <w:pStyle w:val="Normal"/>
+        <w:spacing w:lineRule="auto" w:line="240"/>
+        <w:jc w:val="both"/>
+        <w:rPr>
+          <w:rFonts w:ascii="Times New Roman" w:hAnsi="Times New Roman"/>
+          <w:color w:val="000000"/>
+        </w:rPr>
+      </w:pPr>
+      <w:r>
+        <w:rPr>
+          <w:rFonts w:cs="Times New Roman" w:ascii="Times New Roman" w:hAnsi="Times New Roman"/>
+          <w:b/>
+          <w:bCs/>
+          <w:color w:val="000000"/>
+          <w:sz w:val="32"/>
+          <w:szCs w:val="32"/>
+        </w:rPr>
+        <w:t xml:space="preserve">Отчет по лабораторной работе </w:t>
       </w:r>
       <w:r>
         <w:rPr>
@@ -32,19 +54,8 @@
           <w:szCs w:val="32"/>
           <w:lang w:val="ru-RU"/>
         </w:rPr>
-        <w:t xml:space="preserve">, 2 курс, 7 группа </w:t>
-      </w:r>
-    </w:p>
-    <w:p>
-      <w:pPr>
-        <w:pStyle w:val="Normal"/>
-        <w:spacing w:lineRule="auto" w:line="240"/>
-        <w:jc w:val="both"/>
-        <w:rPr>
-          <w:rFonts w:ascii="Times New Roman" w:hAnsi="Times New Roman"/>
-          <w:color w:val="000000"/>
-        </w:rPr>
-      </w:pPr>
+        <w:t xml:space="preserve">4 – Разработка таблиц в СУБД </w:t>
+      </w:r>
       <w:r>
         <w:rPr>
           <w:rFonts w:cs="Times New Roman" w:ascii="Times New Roman" w:hAnsi="Times New Roman"/>
@@ -53,8 +64,9 @@
           <w:color w:val="000000"/>
           <w:sz w:val="32"/>
           <w:szCs w:val="32"/>
-        </w:rPr>
-        <w:t xml:space="preserve">Отчет по лабораторной работе </w:t>
+          <w:lang w:val="en-US"/>
+        </w:rPr>
+        <w:t>MS</w:t>
       </w:r>
       <w:r>
         <w:rPr>
@@ -66,7 +78,7 @@
           <w:szCs w:val="32"/>
           <w:lang w:val="ru-RU"/>
         </w:rPr>
-        <w:t xml:space="preserve">4 – Разработка таблиц в СУБД </w:t>
+        <w:t xml:space="preserve"> </w:t>
       </w:r>
       <w:r>
         <w:rPr>
@@ -78,7 +90,7 @@
           <w:szCs w:val="32"/>
           <w:lang w:val="en-US"/>
         </w:rPr>
-        <w:t>MS</w:t>
+        <w:t>SQL</w:t>
       </w:r>
       <w:r>
         <w:rPr>
@@ -102,30 +114,6 @@
           <w:szCs w:val="32"/>
           <w:lang w:val="en-US"/>
         </w:rPr>
-        <w:t>SQL</w:t>
-      </w:r>
-      <w:r>
-        <w:rPr>
-          <w:rFonts w:cs="Times New Roman" w:ascii="Times New Roman" w:hAnsi="Times New Roman"/>
-          <w:b/>
-          <w:bCs/>
-          <w:color w:val="000000"/>
-          <w:sz w:val="32"/>
-          <w:szCs w:val="32"/>
-          <w:lang w:val="ru-RU"/>
-        </w:rPr>
-        <w:t xml:space="preserve"> </w:t>
-      </w:r>
-      <w:r>
-        <w:rPr>
-          <w:rFonts w:cs="Times New Roman" w:ascii="Times New Roman" w:hAnsi="Times New Roman"/>
-          <w:b/>
-          <w:bCs/>
-          <w:color w:val="000000"/>
-          <w:sz w:val="32"/>
-          <w:szCs w:val="32"/>
-          <w:lang w:val="en-US"/>
-        </w:rPr>
         <w:t>Server</w:t>
       </w:r>
     </w:p>
@@ -138,7 +126,7 @@
       <w:r>
         <w:rPr>
           <w:rStyle w:val="HTMLCode"/>
-          <w:rFonts w:cs="Times New Roman" w:ascii="Times New Roman" w:hAnsi="Times New Roman"/>
+          <w:rFonts w:cs="Times New Roman"/>
           <w:color w:val="000000"/>
           <w:sz w:val="24"/>
           <w:szCs w:val="24"/>
@@ -147,6 +135,166 @@
         <w:t>Физическая модель данных:</w:t>
         <w:br/>
       </w:r>
+      <w:r>
+        <w:rPr>
+          <w:rStyle w:val="Strong"/>
+          <w:rFonts w:eastAsia="Times New Roman" w:cs="Times New Roman"/>
+          <w:b/>
+          <w:i w:val="false"/>
+          <w:caps w:val="false"/>
+          <w:smallCaps w:val="false"/>
+          <w:color w:val="000000"/>
+          <w:spacing w:val="0"/>
+          <w:sz w:val="24"/>
+          <w:szCs w:val="24"/>
+          <w:lang w:val="ru-RU" w:eastAsia="ru-BY"/>
+        </w:rPr>
+        <w:br/>
+        <w:t>Авторы_отчётов:</w:t>
+      </w:r>
+    </w:p>
+    <w:p>
+      <w:pPr>
+        <w:pStyle w:val="BodyText"/>
+        <w:widowControl/>
+        <w:numPr>
+          <w:ilvl w:val="0"/>
+          <w:numId w:val="2"/>
+        </w:numPr>
+        <w:tabs>
+          <w:tab w:val="clear" w:pos="720"/>
+          <w:tab w:val="left" w:pos="0" w:leader="none"/>
+        </w:tabs>
+        <w:spacing w:lineRule="auto" w:line="240" w:before="0" w:after="0"/>
+        <w:ind w:hanging="0" w:start="0" w:end="0"/>
+        <w:rPr>
+          <w:rFonts w:ascii="Times New Roman" w:hAnsi="Times New Roman" w:eastAsia="Times New Roman" w:cs="Times New Roman"/>
+          <w:b w:val="false"/>
+          <w:i w:val="false"/>
+          <w:caps w:val="false"/>
+          <w:smallCaps w:val="false"/>
+          <w:color w:val="000000"/>
+          <w:spacing w:val="0"/>
+          <w:sz w:val="24"/>
+          <w:szCs w:val="24"/>
+          <w:lang w:val="ru-RU" w:eastAsia="ru-BY"/>
+        </w:rPr>
+      </w:pPr>
+      <w:r>
+        <w:rPr>
+          <w:rFonts w:eastAsia="Times New Roman" w:cs="Times New Roman" w:ascii="Times New Roman" w:hAnsi="Times New Roman"/>
+          <w:b w:val="false"/>
+          <w:i w:val="false"/>
+          <w:caps w:val="false"/>
+          <w:smallCaps w:val="false"/>
+          <w:color w:val="000000"/>
+          <w:spacing w:val="0"/>
+          <w:sz w:val="24"/>
+          <w:szCs w:val="24"/>
+          <w:lang w:val="ru-RU" w:eastAsia="ru-BY"/>
+        </w:rPr>
+        <w:t>ID_автора: INT IDENTITY(1,1) (PRIMARY KEY)</w:t>
+      </w:r>
+    </w:p>
+    <w:p>
+      <w:pPr>
+        <w:pStyle w:val="BodyText"/>
+        <w:widowControl/>
+        <w:numPr>
+          <w:ilvl w:val="0"/>
+          <w:numId w:val="2"/>
+        </w:numPr>
+        <w:tabs>
+          <w:tab w:val="clear" w:pos="720"/>
+          <w:tab w:val="left" w:pos="0" w:leader="none"/>
+        </w:tabs>
+        <w:spacing w:lineRule="auto" w:line="240" w:before="0" w:after="0"/>
+        <w:ind w:hanging="0" w:start="0" w:end="0"/>
+        <w:rPr>
+          <w:rFonts w:ascii="Times New Roman" w:hAnsi="Times New Roman" w:eastAsia="Times New Roman" w:cs="Times New Roman"/>
+          <w:b w:val="false"/>
+          <w:i w:val="false"/>
+          <w:caps w:val="false"/>
+          <w:smallCaps w:val="false"/>
+          <w:color w:val="000000"/>
+          <w:spacing w:val="0"/>
+          <w:sz w:val="24"/>
+          <w:szCs w:val="24"/>
+          <w:lang w:val="ru-RU" w:eastAsia="ru-BY"/>
+        </w:rPr>
+      </w:pPr>
+      <w:r>
+        <w:rPr>
+          <w:rFonts w:eastAsia="Times New Roman" w:cs="Times New Roman" w:ascii="Times New Roman" w:hAnsi="Times New Roman"/>
+          <w:b w:val="false"/>
+          <w:i w:val="false"/>
+          <w:caps w:val="false"/>
+          <w:smallCaps w:val="false"/>
+          <w:color w:val="000000"/>
+          <w:spacing w:val="0"/>
+          <w:sz w:val="24"/>
+          <w:szCs w:val="24"/>
+          <w:lang w:val="ru-RU" w:eastAsia="ru-BY"/>
+        </w:rPr>
+        <w:t>ФИО_автора: NVARCHAR(150) (NOT NULL, CHECK (ФИО_автора LIKE '% %'))</w:t>
+      </w:r>
+    </w:p>
+    <w:p>
+      <w:pPr>
+        <w:pStyle w:val="BodyText"/>
+        <w:widowControl/>
+        <w:numPr>
+          <w:ilvl w:val="0"/>
+          <w:numId w:val="2"/>
+        </w:numPr>
+        <w:tabs>
+          <w:tab w:val="clear" w:pos="720"/>
+          <w:tab w:val="left" w:pos="0" w:leader="none"/>
+        </w:tabs>
+        <w:spacing w:lineRule="auto" w:line="240" w:before="0" w:after="0"/>
+        <w:ind w:hanging="0" w:start="0" w:end="0"/>
+        <w:rPr>
+          <w:rFonts w:ascii="Times New Roman" w:hAnsi="Times New Roman" w:eastAsia="Times New Roman" w:cs="Times New Roman"/>
+          <w:b w:val="false"/>
+          <w:i w:val="false"/>
+          <w:caps w:val="false"/>
+          <w:smallCaps w:val="false"/>
+          <w:color w:val="000000"/>
+          <w:spacing w:val="0"/>
+          <w:sz w:val="24"/>
+          <w:szCs w:val="24"/>
+          <w:lang w:val="ru-RU" w:eastAsia="ru-BY"/>
+        </w:rPr>
+      </w:pPr>
+      <w:r>
+        <w:rPr>
+          <w:rFonts w:eastAsia="Times New Roman" w:cs="Times New Roman" w:ascii="Times New Roman" w:hAnsi="Times New Roman"/>
+          <w:b w:val="false"/>
+          <w:i w:val="false"/>
+          <w:caps w:val="false"/>
+          <w:smallCaps w:val="false"/>
+          <w:color w:val="000000"/>
+          <w:spacing w:val="0"/>
+          <w:sz w:val="24"/>
+          <w:szCs w:val="24"/>
+          <w:lang w:val="ru-RU" w:eastAsia="ru-BY"/>
+        </w:rPr>
+        <w:t>Дата_рождения: DATE (NOT NULL)</w:t>
+      </w:r>
+    </w:p>
+    <w:p>
+      <w:pPr>
+        <w:pStyle w:val="BodyText"/>
+        <w:widowControl/>
+        <w:spacing w:lineRule="auto" w:line="240" w:before="240" w:after="240"/>
+        <w:ind w:hanging="0" w:start="0" w:end="0"/>
+        <w:rPr>
+          <w:rFonts w:ascii="Times New Roman" w:hAnsi="Times New Roman" w:eastAsia="Times New Roman" w:cs="Times New Roman"/>
+          <w:sz w:val="24"/>
+          <w:szCs w:val="24"/>
+          <w:lang w:val="ru-RU" w:eastAsia="ru-BY"/>
+        </w:rPr>
+      </w:pPr>
       <w:r>
         <w:rPr>
           <w:rStyle w:val="Strong"/>
@@ -161,8 +309,7 @@
           <w:szCs w:val="24"/>
           <w:lang w:val="ru-RU" w:eastAsia="ru-BY"/>
         </w:rPr>
-        <w:br/>
-        <w:t>Авторы_отчётов:</w:t>
+        <w:t>Отчёты:</w:t>
       </w:r>
     </w:p>
     <w:p>
@@ -171,9 +318,8 @@
         <w:widowControl/>
         <w:numPr>
           <w:ilvl w:val="0"/>
-          <w:numId w:val="1"/>
+          <w:numId w:val="3"/>
         </w:numPr>
-        <w:pBdr/>
         <w:tabs>
           <w:tab w:val="clear" w:pos="720"/>
           <w:tab w:val="left" w:pos="0" w:leader="none"/>
@@ -206,7 +352,7 @@
           <w:szCs w:val="24"/>
           <w:lang w:val="ru-RU" w:eastAsia="ru-BY"/>
         </w:rPr>
-        <w:t>ID_автора: INT IDENTITY(1,1) (PRIMARY KEY)</w:t>
+        <w:t>ID_отчёта: INT IDENTITY(1,1) (PRIMARY KEY)</w:t>
       </w:r>
     </w:p>
     <w:p>
@@ -215,9 +361,8 @@
         <w:widowControl/>
         <w:numPr>
           <w:ilvl w:val="0"/>
-          <w:numId w:val="1"/>
+          <w:numId w:val="3"/>
         </w:numPr>
-        <w:pBdr/>
         <w:tabs>
           <w:tab w:val="clear" w:pos="720"/>
           <w:tab w:val="left" w:pos="0" w:leader="none"/>
@@ -250,7 +395,7 @@
           <w:szCs w:val="24"/>
           <w:lang w:val="ru-RU" w:eastAsia="ru-BY"/>
         </w:rPr>
-        <w:t>ФИО_автора: NVARCHAR(150) (NOT NULL, CHECK (ФИО_автора LIKE '% %'))</w:t>
+        <w:t>Название_отчёта: NVARCHAR(200) (NOT NULL)</w:t>
       </w:r>
     </w:p>
     <w:p>
@@ -259,9 +404,8 @@
         <w:widowControl/>
         <w:numPr>
           <w:ilvl w:val="0"/>
-          <w:numId w:val="1"/>
+          <w:numId w:val="3"/>
         </w:numPr>
-        <w:pBdr/>
         <w:tabs>
           <w:tab w:val="clear" w:pos="720"/>
           <w:tab w:val="left" w:pos="0" w:leader="none"/>
@@ -294,7 +438,50 @@
           <w:szCs w:val="24"/>
           <w:lang w:val="ru-RU" w:eastAsia="ru-BY"/>
         </w:rPr>
-        <w:t>Дата_рождения: DATE (NOT NULL)</w:t>
+        <w:t>Дата_создания: DATE (NOT NULL, DEFAULT GETDATE())</w:t>
+      </w:r>
+    </w:p>
+    <w:p>
+      <w:pPr>
+        <w:pStyle w:val="BodyText"/>
+        <w:widowControl/>
+        <w:numPr>
+          <w:ilvl w:val="0"/>
+          <w:numId w:val="3"/>
+        </w:numPr>
+        <w:tabs>
+          <w:tab w:val="clear" w:pos="720"/>
+          <w:tab w:val="left" w:pos="0" w:leader="none"/>
+        </w:tabs>
+        <w:spacing w:lineRule="auto" w:line="240" w:before="0" w:after="0"/>
+        <w:ind w:hanging="0" w:start="0" w:end="0"/>
+        <w:rPr>
+          <w:rFonts w:ascii="Times New Roman" w:hAnsi="Times New Roman" w:eastAsia="Times New Roman" w:cs="Times New Roman"/>
+          <w:b w:val="false"/>
+          <w:i w:val="false"/>
+          <w:caps w:val="false"/>
+          <w:smallCaps w:val="false"/>
+          <w:color w:val="000000"/>
+          <w:spacing w:val="0"/>
+          <w:sz w:val="24"/>
+          <w:szCs w:val="24"/>
+          <w:lang w:val="ru-RU" w:eastAsia="ru-BY"/>
+        </w:rPr>
+      </w:pPr>
+      <w:r>
+        <w:rPr>
+          <w:rFonts w:eastAsia="Times New Roman" w:cs="Times New Roman" w:ascii="Times New Roman" w:hAnsi="Times New Roman"/>
+          <w:b w:val="false"/>
+          <w:i w:val="false"/>
+          <w:caps w:val="false"/>
+          <w:smallCaps w:val="false"/>
+          <w:color w:val="000000"/>
+          <w:spacing w:val="0"/>
+          <w:sz w:val="24"/>
+          <w:szCs w:val="24"/>
+          <w:lang w:val="ru-RU" w:eastAsia="ru-BY"/>
+        </w:rPr>
+        <w:t>ID_автора: INT (NOT NULL, FOREIGN KEY REFERENCES Авторы_отчётов(ID_автора) ON DELETE NO ACTION ON UPDATE NO ACTION)</w:t>
       </w:r>
     </w:p>
     <w:p>
@@ -324,7 +511,7 @@
           <w:szCs w:val="24"/>
           <w:lang w:val="ru-RU" w:eastAsia="ru-BY"/>
         </w:rPr>
-        <w:t>Отчёты:</w:t>
+        <w:t>Отчёты_об_отчётах:</w:t>
       </w:r>
     </w:p>
     <w:p>
@@ -333,9 +520,8 @@
         <w:widowControl/>
         <w:numPr>
           <w:ilvl w:val="0"/>
-          <w:numId w:val="2"/>
+          <w:numId w:val="4"/>
         </w:numPr>
-        <w:pBdr/>
         <w:tabs>
           <w:tab w:val="clear" w:pos="720"/>
           <w:tab w:val="left" w:pos="0" w:leader="none"/>
@@ -368,7 +554,7 @@
           <w:szCs w:val="24"/>
           <w:lang w:val="ru-RU" w:eastAsia="ru-BY"/>
         </w:rPr>
-        <w:t>ID_отчёта: INT IDENTITY(1,1) (PRIMARY KEY)</w:t>
+        <w:t>ID_отчёта_об_отчётах: INT IDENTITY(1,1) (PRIMARY KEY)</w:t>
       </w:r>
     </w:p>
     <w:p>
@@ -377,9 +563,8 @@
         <w:widowControl/>
         <w:numPr>
           <w:ilvl w:val="0"/>
-          <w:numId w:val="2"/>
+          <w:numId w:val="4"/>
         </w:numPr>
-        <w:pBdr/>
         <w:tabs>
           <w:tab w:val="clear" w:pos="720"/>
           <w:tab w:val="left" w:pos="0" w:leader="none"/>
@@ -412,7 +597,7 @@
           <w:szCs w:val="24"/>
           <w:lang w:val="ru-RU" w:eastAsia="ru-BY"/>
         </w:rPr>
-        <w:t>Название_отчёта: NVARCHAR(200) (NOT NULL)</w:t>
+        <w:t>Название_отчёта_об_отчётах: NVARCHAR(200) (NOT NULL)</w:t>
       </w:r>
     </w:p>
     <w:p>
@@ -421,9 +606,8 @@
         <w:widowControl/>
         <w:numPr>
           <w:ilvl w:val="0"/>
-          <w:numId w:val="2"/>
+          <w:numId w:val="4"/>
         </w:numPr>
-        <w:pBdr/>
         <w:tabs>
           <w:tab w:val="clear" w:pos="720"/>
           <w:tab w:val="left" w:pos="0" w:leader="none"/>
@@ -465,9 +649,8 @@
         <w:widowControl/>
         <w:numPr>
           <w:ilvl w:val="0"/>
-          <w:numId w:val="2"/>
+          <w:numId w:val="4"/>
         </w:numPr>
-        <w:pBdr/>
         <w:tabs>
           <w:tab w:val="clear" w:pos="720"/>
           <w:tab w:val="left" w:pos="0" w:leader="none"/>
@@ -530,7 +713,7 @@
           <w:szCs w:val="24"/>
           <w:lang w:val="ru-RU" w:eastAsia="ru-BY"/>
         </w:rPr>
-        <w:t>Отчёты_об_отчётах:</w:t>
+        <w:t>Связи_отчётов_и_отчётов_об_отчётах:</w:t>
       </w:r>
     </w:p>
     <w:p>
@@ -539,9 +722,8 @@
         <w:widowControl/>
         <w:numPr>
           <w:ilvl w:val="0"/>
-          <w:numId w:val="3"/>
+          <w:numId w:val="5"/>
         </w:numPr>
-        <w:pBdr/>
         <w:tabs>
           <w:tab w:val="clear" w:pos="720"/>
           <w:tab w:val="left" w:pos="0" w:leader="none"/>
@@ -574,7 +756,7 @@
           <w:szCs w:val="24"/>
           <w:lang w:val="ru-RU" w:eastAsia="ru-BY"/>
         </w:rPr>
-        <w:t>ID_отчёта_об_отчётах: INT IDENTITY(1,1) (PRIMARY KEY)</w:t>
+        <w:t>ID_отчёта_об_отчётах: INT (NOT NULL, часть составного первичного ключа, FOREIGN KEY REFERENCES Отчёты_об_отчётах(ID_отчёта_об_отчётах) ON DELETE CASCADE ON UPDATE CASCADE)</w:t>
       </w:r>
     </w:p>
     <w:p>
@@ -583,9 +765,8 @@
         <w:widowControl/>
         <w:numPr>
           <w:ilvl w:val="0"/>
-          <w:numId w:val="3"/>
+          <w:numId w:val="5"/>
         </w:numPr>
-        <w:pBdr/>
         <w:tabs>
           <w:tab w:val="clear" w:pos="720"/>
           <w:tab w:val="left" w:pos="0" w:leader="none"/>
@@ -593,7 +774,15 @@
         <w:spacing w:lineRule="auto" w:line="240" w:before="0" w:after="0"/>
         <w:ind w:hanging="0" w:start="0" w:end="0"/>
         <w:rPr>
-          <w:rFonts w:ascii="Times New Roman" w:hAnsi="Times New Roman" w:eastAsia="Times New Roman" w:cs="Times New Roman"/>
+          <w:rFonts w:ascii="Times New Roman" w:hAnsi="Times New Roman"/>
+          <w:b w:val="false"/>
+          <w:color w:val="000000"/>
+          <w:sz w:val="24"/>
+        </w:rPr>
+      </w:pPr>
+      <w:r>
+        <w:rPr>
+          <w:rFonts w:eastAsia="Times New Roman" w:cs="Times New Roman" w:ascii="Times New Roman" w:hAnsi="Times New Roman"/>
           <w:b w:val="false"/>
           <w:i w:val="false"/>
           <w:caps w:val="false"/>
@@ -604,242 +793,13 @@
           <w:szCs w:val="24"/>
           <w:lang w:val="ru-RU" w:eastAsia="ru-BY"/>
         </w:rPr>
-      </w:pPr>
-      <w:r>
-        <w:rPr>
-          <w:rFonts w:eastAsia="Times New Roman" w:cs="Times New Roman" w:ascii="Times New Roman" w:hAnsi="Times New Roman"/>
-          <w:b w:val="false"/>
-          <w:i w:val="false"/>
-          <w:caps w:val="false"/>
-          <w:smallCaps w:val="false"/>
-          <w:color w:val="000000"/>
-          <w:spacing w:val="0"/>
-          <w:sz w:val="24"/>
-          <w:szCs w:val="24"/>
-          <w:lang w:val="ru-RU" w:eastAsia="ru-BY"/>
-        </w:rPr>
-        <w:t>Название_отчёта_об_отчётах: NVARCHAR(200) (NOT NULL)</w:t>
-      </w:r>
-    </w:p>
-    <w:p>
-      <w:pPr>
-        <w:pStyle w:val="BodyText"/>
-        <w:widowControl/>
-        <w:numPr>
-          <w:ilvl w:val="0"/>
-          <w:numId w:val="3"/>
-        </w:numPr>
-        <w:pBdr/>
-        <w:tabs>
-          <w:tab w:val="clear" w:pos="720"/>
-          <w:tab w:val="left" w:pos="0" w:leader="none"/>
-        </w:tabs>
-        <w:spacing w:lineRule="auto" w:line="240" w:before="0" w:after="0"/>
-        <w:ind w:hanging="0" w:start="0" w:end="0"/>
-        <w:rPr>
-          <w:rFonts w:ascii="Times New Roman" w:hAnsi="Times New Roman" w:eastAsia="Times New Roman" w:cs="Times New Roman"/>
-          <w:b w:val="false"/>
-          <w:i w:val="false"/>
-          <w:caps w:val="false"/>
-          <w:smallCaps w:val="false"/>
-          <w:color w:val="000000"/>
-          <w:spacing w:val="0"/>
-          <w:sz w:val="24"/>
-          <w:szCs w:val="24"/>
-          <w:lang w:val="ru-RU" w:eastAsia="ru-BY"/>
-        </w:rPr>
-      </w:pPr>
-      <w:r>
-        <w:rPr>
-          <w:rFonts w:eastAsia="Times New Roman" w:cs="Times New Roman" w:ascii="Times New Roman" w:hAnsi="Times New Roman"/>
-          <w:b w:val="false"/>
-          <w:i w:val="false"/>
-          <w:caps w:val="false"/>
-          <w:smallCaps w:val="false"/>
-          <w:color w:val="000000"/>
-          <w:spacing w:val="0"/>
-          <w:sz w:val="24"/>
-          <w:szCs w:val="24"/>
-          <w:lang w:val="ru-RU" w:eastAsia="ru-BY"/>
-        </w:rPr>
-        <w:t>Дата_создания: DATE (NOT NULL, DEFAULT GETDATE())</w:t>
-      </w:r>
-    </w:p>
-    <w:p>
-      <w:pPr>
-        <w:pStyle w:val="BodyText"/>
-        <w:widowControl/>
-        <w:numPr>
-          <w:ilvl w:val="0"/>
-          <w:numId w:val="3"/>
-        </w:numPr>
-        <w:pBdr/>
-        <w:tabs>
-          <w:tab w:val="clear" w:pos="720"/>
-          <w:tab w:val="left" w:pos="0" w:leader="none"/>
-        </w:tabs>
-        <w:spacing w:lineRule="auto" w:line="240" w:before="0" w:after="0"/>
-        <w:ind w:hanging="0" w:start="0" w:end="0"/>
-        <w:rPr>
-          <w:rFonts w:ascii="Times New Roman" w:hAnsi="Times New Roman" w:eastAsia="Times New Roman" w:cs="Times New Roman"/>
-          <w:b w:val="false"/>
-          <w:i w:val="false"/>
-          <w:caps w:val="false"/>
-          <w:smallCaps w:val="false"/>
-          <w:color w:val="000000"/>
-          <w:spacing w:val="0"/>
-          <w:sz w:val="24"/>
-          <w:szCs w:val="24"/>
-          <w:lang w:val="ru-RU" w:eastAsia="ru-BY"/>
-        </w:rPr>
-      </w:pPr>
-      <w:r>
-        <w:rPr>
-          <w:rFonts w:eastAsia="Times New Roman" w:cs="Times New Roman" w:ascii="Times New Roman" w:hAnsi="Times New Roman"/>
-          <w:b w:val="false"/>
-          <w:i w:val="false"/>
-          <w:caps w:val="false"/>
-          <w:smallCaps w:val="false"/>
-          <w:color w:val="000000"/>
-          <w:spacing w:val="0"/>
-          <w:sz w:val="24"/>
-          <w:szCs w:val="24"/>
-          <w:lang w:val="ru-RU" w:eastAsia="ru-BY"/>
-        </w:rPr>
-        <w:t>ID_автора: INT (NOT NULL, FOREIGN KEY REFERENCES Авторы_отчётов(ID_автора) ON DELETE NO ACTION ON UPDATE NO ACTION)</w:t>
-      </w:r>
-    </w:p>
-    <w:p>
-      <w:pPr>
-        <w:pStyle w:val="BodyText"/>
-        <w:widowControl/>
-        <w:spacing w:lineRule="auto" w:line="240" w:before="240" w:after="240"/>
-        <w:ind w:hanging="0" w:start="0" w:end="0"/>
-        <w:rPr>
-          <w:rFonts w:ascii="Times New Roman" w:hAnsi="Times New Roman" w:eastAsia="Times New Roman" w:cs="Times New Roman"/>
-          <w:sz w:val="24"/>
-          <w:szCs w:val="24"/>
-          <w:lang w:val="ru-RU" w:eastAsia="ru-BY"/>
-        </w:rPr>
-      </w:pPr>
-      <w:r>
-        <w:rPr>
-          <w:rStyle w:val="Strong"/>
-          <w:rFonts w:eastAsia="Times New Roman" w:cs="Times New Roman" w:ascii="Times New Roman" w:hAnsi="Times New Roman"/>
-          <w:b/>
-          <w:i w:val="false"/>
-          <w:caps w:val="false"/>
-          <w:smallCaps w:val="false"/>
-          <w:color w:val="000000"/>
-          <w:spacing w:val="0"/>
-          <w:sz w:val="24"/>
-          <w:szCs w:val="24"/>
-          <w:lang w:val="ru-RU" w:eastAsia="ru-BY"/>
-        </w:rPr>
-        <w:t>Связи_отчётов_и_отчётов_об_отчётах:</w:t>
-      </w:r>
-    </w:p>
-    <w:p>
-      <w:pPr>
-        <w:pStyle w:val="BodyText"/>
-        <w:widowControl/>
-        <w:numPr>
-          <w:ilvl w:val="0"/>
-          <w:numId w:val="4"/>
-        </w:numPr>
-        <w:pBdr/>
-        <w:tabs>
-          <w:tab w:val="clear" w:pos="720"/>
-          <w:tab w:val="left" w:pos="0" w:leader="none"/>
-        </w:tabs>
-        <w:spacing w:lineRule="auto" w:line="240" w:before="0" w:after="0"/>
-        <w:ind w:hanging="0" w:start="0" w:end="0"/>
-        <w:rPr>
-          <w:rFonts w:ascii="Times New Roman" w:hAnsi="Times New Roman" w:eastAsia="Times New Roman" w:cs="Times New Roman"/>
-          <w:b w:val="false"/>
-          <w:i w:val="false"/>
-          <w:caps w:val="false"/>
-          <w:smallCaps w:val="false"/>
-          <w:color w:val="000000"/>
-          <w:spacing w:val="0"/>
-          <w:sz w:val="24"/>
-          <w:szCs w:val="24"/>
-          <w:lang w:val="ru-RU" w:eastAsia="ru-BY"/>
-        </w:rPr>
-      </w:pPr>
-      <w:r>
-        <w:rPr>
-          <w:rFonts w:eastAsia="Times New Roman" w:cs="Times New Roman" w:ascii="Times New Roman" w:hAnsi="Times New Roman"/>
-          <w:b w:val="false"/>
-          <w:i w:val="false"/>
-          <w:caps w:val="false"/>
-          <w:smallCaps w:val="false"/>
-          <w:color w:val="000000"/>
-          <w:spacing w:val="0"/>
-          <w:sz w:val="24"/>
-          <w:szCs w:val="24"/>
-          <w:lang w:val="ru-RU" w:eastAsia="ru-BY"/>
-        </w:rPr>
-        <w:t>ID_отчёта_об_отчётах: INT (NOT NULL, часть составного первичного ключа, FOREIGN KEY REFERENCES Отчёты_об_отчётах(ID_отчёта_об_отчётах) ON DELETE CASCADE ON UPDATE CASCADE)</w:t>
-      </w:r>
-    </w:p>
-    <w:p>
-      <w:pPr>
-        <w:pStyle w:val="BodyText"/>
-        <w:widowControl/>
-        <w:numPr>
-          <w:ilvl w:val="0"/>
-          <w:numId w:val="4"/>
-        </w:numPr>
-        <w:pBdr/>
-        <w:tabs>
-          <w:tab w:val="clear" w:pos="720"/>
-          <w:tab w:val="left" w:pos="0" w:leader="none"/>
-        </w:tabs>
-        <w:spacing w:lineRule="auto" w:line="240" w:before="0" w:after="0"/>
-        <w:ind w:hanging="0" w:start="0" w:end="0"/>
-        <w:rPr>
-          <w:rFonts w:ascii="Times New Roman" w:hAnsi="Times New Roman"/>
-          <w:b w:val="false"/>
-          <w:color w:val="000000"/>
-          <w:sz w:val="24"/>
-        </w:rPr>
-      </w:pPr>
-      <w:r>
-        <w:rPr>
-          <w:rFonts w:eastAsia="Times New Roman" w:cs="Times New Roman" w:ascii="Times New Roman" w:hAnsi="Times New Roman"/>
-          <w:b w:val="false"/>
-          <w:i w:val="false"/>
-          <w:caps w:val="false"/>
-          <w:smallCaps w:val="false"/>
-          <w:color w:val="000000"/>
-          <w:spacing w:val="0"/>
-          <w:sz w:val="24"/>
-          <w:szCs w:val="24"/>
-          <w:lang w:val="ru-RU" w:eastAsia="ru-BY"/>
-        </w:rPr>
         <w:t>ID_отчёта: INT (NOT NULL, часть составного первичного ключа, FOREIGN KEY REFERENCES Отчёты(ID_отчёта) ON DELETE CASCADE ON UPDATE CASCADE)</w:t>
         <w:br/>
         <w:t>PRIMARY KEY (ID_отчёта_об_отчётах, ID_отчёта)</w:t>
         <w:br/>
         <w:br/>
         <w:br/>
-        <w:t xml:space="preserve">База данных была созданна </w:t>
-      </w:r>
-      <w:r>
-        <w:rPr>
-          <w:rFonts w:eastAsia="Times New Roman" w:cs="Times New Roman" w:ascii="Times New Roman" w:hAnsi="Times New Roman"/>
-          <w:b w:val="false"/>
-          <w:i w:val="false"/>
-          <w:caps w:val="false"/>
-          <w:smallCaps w:val="false"/>
-          <w:color w:val="000000"/>
-          <w:spacing w:val="0"/>
-          <w:sz w:val="24"/>
-          <w:szCs w:val="24"/>
-          <w:lang w:val="ru-RU" w:eastAsia="ru-BY"/>
-        </w:rPr>
-        <w:t>путём выполнения следующего запроса в mssql server:</w:t>
+        <w:t>База данных была созданна путём выполнения следующего запроса в mssql server:</w:t>
         <w:br/>
         <w:br/>
       </w:r>
@@ -4496,9 +4456,339 @@
       </w:pPr>
       <w:r>
         <w:rPr>
+          <w:color w:val="000000"/>
+        </w:rPr>
+      </w:r>
+    </w:p>
+    <w:p>
+      <w:pPr>
+        <w:pStyle w:val="NormalWeb"/>
+        <w:spacing w:before="280" w:after="280"/>
+        <w:rPr>
           <w:rFonts w:ascii="Times New Roman" w:hAnsi="Times New Roman"/>
           <w:color w:val="000000"/>
         </w:rPr>
+      </w:pPr>
+      <w:r>
+        <w:rPr>
+          <w:color w:val="000000"/>
+        </w:rPr>
+        <w:t>Чтобы показать, что индекс в дейтвительности был создан, можно выполнить следующий зарпос:</w:t>
+        <w:br/>
+      </w:r>
+      <w:r>
+        <w:rPr>
+          <w:rFonts w:ascii="Droid Sans Mono;monospace" w:hAnsi="Droid Sans Mono;monospace"/>
+          <w:b w:val="false"/>
+          <w:color w:val="FB4934"/>
+          <w:sz w:val="21"/>
+          <w:shd w:fill="282828" w:val="clear"/>
+        </w:rPr>
+        <w:t>use</w:t>
+      </w:r>
+      <w:r>
+        <w:rPr>
+          <w:rFonts w:ascii="Droid Sans Mono;monospace" w:hAnsi="Droid Sans Mono;monospace"/>
+          <w:b w:val="false"/>
+          <w:color w:val="EBDBB2"/>
+          <w:sz w:val="21"/>
+          <w:shd w:fill="282828" w:val="clear"/>
+        </w:rPr>
+        <w:t xml:space="preserve"> ReportsDatabase;</w:t>
+      </w:r>
+    </w:p>
+    <w:p>
+      <w:pPr>
+        <w:pStyle w:val="Normal"/>
+        <w:spacing w:lineRule="atLeast" w:line="285" w:before="0" w:after="0"/>
+        <w:ind w:hanging="0" w:start="0" w:end="0"/>
+        <w:rPr>
+          <w:rFonts w:ascii="Droid Sans Mono;monospace" w:hAnsi="Droid Sans Mono;monospace"/>
+          <w:b w:val="false"/>
+          <w:color w:val="FB4934"/>
+          <w:sz w:val="21"/>
+          <w:shd w:fill="282828" w:val="clear"/>
+        </w:rPr>
+      </w:pPr>
+      <w:r>
+        <w:rPr>
+          <w:rFonts w:ascii="Droid Sans Mono;monospace" w:hAnsi="Droid Sans Mono;monospace"/>
+          <w:b w:val="false"/>
+          <w:color w:val="FB4934"/>
+          <w:sz w:val="21"/>
+          <w:shd w:fill="282828" w:val="clear"/>
+        </w:rPr>
+        <w:t>GO</w:t>
+      </w:r>
+    </w:p>
+    <w:p>
+      <w:pPr>
+        <w:pStyle w:val="Normal"/>
+        <w:spacing w:lineRule="atLeast" w:line="285" w:before="0" w:after="0"/>
+        <w:ind w:hanging="0" w:start="0" w:end="0"/>
+        <w:rPr>
+          <w:rFonts w:ascii="Droid Sans Mono;monospace" w:hAnsi="Droid Sans Mono;monospace"/>
+          <w:b w:val="false"/>
+          <w:color w:val="EBDBB2"/>
+          <w:sz w:val="21"/>
+          <w:shd w:fill="282828" w:val="clear"/>
+        </w:rPr>
+      </w:pPr>
+      <w:r>
+        <w:rPr>
+          <w:rFonts w:ascii="Droid Sans Mono;monospace" w:hAnsi="Droid Sans Mono;monospace"/>
+          <w:b w:val="false"/>
+          <w:color w:val="FB4934"/>
+          <w:sz w:val="21"/>
+          <w:shd w:fill="282828" w:val="clear"/>
+        </w:rPr>
+        <w:t>SELECT</w:t>
+      </w:r>
+      <w:r>
+        <w:rPr>
+          <w:rFonts w:ascii="Droid Sans Mono;monospace" w:hAnsi="Droid Sans Mono;monospace"/>
+          <w:b w:val="false"/>
+          <w:color w:val="EBDBB2"/>
+          <w:sz w:val="21"/>
+          <w:shd w:fill="282828" w:val="clear"/>
+        </w:rPr>
+        <w:t xml:space="preserve"> </w:t>
+      </w:r>
+      <w:r>
+        <w:rPr>
+          <w:rFonts w:ascii="Droid Sans Mono;monospace" w:hAnsi="Droid Sans Mono;monospace"/>
+          <w:b w:val="false"/>
+          <w:color w:val="8EC07C"/>
+          <w:sz w:val="21"/>
+          <w:shd w:fill="282828" w:val="clear"/>
+        </w:rPr>
+        <w:t>*</w:t>
+      </w:r>
+    </w:p>
+    <w:p>
+      <w:pPr>
+        <w:pStyle w:val="Normal"/>
+        <w:spacing w:lineRule="atLeast" w:line="285" w:before="0" w:after="0"/>
+        <w:ind w:hanging="0" w:start="0" w:end="0"/>
+        <w:rPr>
+          <w:rFonts w:ascii="Droid Sans Mono;monospace" w:hAnsi="Droid Sans Mono;monospace"/>
+          <w:b w:val="false"/>
+          <w:color w:val="EBDBB2"/>
+          <w:sz w:val="21"/>
+          <w:shd w:fill="282828" w:val="clear"/>
+        </w:rPr>
+      </w:pPr>
+      <w:r>
+        <w:rPr>
+          <w:rFonts w:ascii="Droid Sans Mono;monospace" w:hAnsi="Droid Sans Mono;monospace"/>
+          <w:b w:val="false"/>
+          <w:color w:val="FB4934"/>
+          <w:sz w:val="21"/>
+          <w:shd w:fill="282828" w:val="clear"/>
+        </w:rPr>
+        <w:t>FROM</w:t>
+      </w:r>
+      <w:r>
+        <w:rPr>
+          <w:rFonts w:ascii="Droid Sans Mono;monospace" w:hAnsi="Droid Sans Mono;monospace"/>
+          <w:b w:val="false"/>
+          <w:color w:val="EBDBB2"/>
+          <w:sz w:val="21"/>
+          <w:shd w:fill="282828" w:val="clear"/>
+        </w:rPr>
+        <w:t xml:space="preserve"> </w:t>
+      </w:r>
+      <w:r>
+        <w:rPr>
+          <w:rFonts w:ascii="Droid Sans Mono;monospace" w:hAnsi="Droid Sans Mono;monospace"/>
+          <w:b w:val="false"/>
+          <w:color w:val="D3869B"/>
+          <w:sz w:val="21"/>
+          <w:shd w:fill="282828" w:val="clear"/>
+        </w:rPr>
+        <w:t>sys</w:t>
+      </w:r>
+      <w:r>
+        <w:rPr>
+          <w:rFonts w:ascii="Droid Sans Mono;monospace" w:hAnsi="Droid Sans Mono;monospace"/>
+          <w:b w:val="false"/>
+          <w:color w:val="EBDBB2"/>
+          <w:sz w:val="21"/>
+          <w:shd w:fill="282828" w:val="clear"/>
+        </w:rPr>
+        <w:t>.</w:t>
+      </w:r>
+      <w:r>
+        <w:rPr>
+          <w:rFonts w:ascii="Droid Sans Mono;monospace" w:hAnsi="Droid Sans Mono;monospace"/>
+          <w:b w:val="false"/>
+          <w:color w:val="D3869B"/>
+          <w:sz w:val="21"/>
+          <w:shd w:fill="282828" w:val="clear"/>
+        </w:rPr>
+        <w:t>indexes</w:t>
+      </w:r>
+    </w:p>
+    <w:p>
+      <w:pPr>
+        <w:pStyle w:val="Normal"/>
+        <w:spacing w:lineRule="atLeast" w:line="285" w:before="0" w:after="0"/>
+        <w:ind w:hanging="0" w:start="0" w:end="0"/>
+        <w:rPr>
+          <w:rFonts w:ascii="Droid Sans Mono;monospace" w:hAnsi="Droid Sans Mono;monospace"/>
+          <w:b w:val="false"/>
+          <w:color w:val="EBDBB2"/>
+          <w:sz w:val="21"/>
+          <w:shd w:fill="282828" w:val="clear"/>
+        </w:rPr>
+      </w:pPr>
+      <w:r>
+        <w:rPr>
+          <w:rFonts w:ascii="Droid Sans Mono;monospace" w:hAnsi="Droid Sans Mono;monospace"/>
+          <w:b w:val="false"/>
+          <w:color w:val="FB4934"/>
+          <w:sz w:val="21"/>
+          <w:shd w:fill="282828" w:val="clear"/>
+        </w:rPr>
+        <w:t>WHERE</w:t>
+      </w:r>
+      <w:r>
+        <w:rPr>
+          <w:rFonts w:ascii="Droid Sans Mono;monospace" w:hAnsi="Droid Sans Mono;monospace"/>
+          <w:b w:val="false"/>
+          <w:color w:val="EBDBB2"/>
+          <w:sz w:val="21"/>
+          <w:shd w:fill="282828" w:val="clear"/>
+        </w:rPr>
+        <w:t xml:space="preserve"> </w:t>
+      </w:r>
+      <w:r>
+        <w:rPr>
+          <w:rFonts w:ascii="Droid Sans Mono;monospace" w:hAnsi="Droid Sans Mono;monospace"/>
+          <w:b w:val="false"/>
+          <w:color w:val="FB4934"/>
+          <w:sz w:val="21"/>
+          <w:shd w:fill="282828" w:val="clear"/>
+        </w:rPr>
+        <w:t>name</w:t>
+      </w:r>
+      <w:r>
+        <w:rPr>
+          <w:rFonts w:ascii="Droid Sans Mono;monospace" w:hAnsi="Droid Sans Mono;monospace"/>
+          <w:b w:val="false"/>
+          <w:color w:val="8EC07C"/>
+          <w:sz w:val="21"/>
+          <w:shd w:fill="282828" w:val="clear"/>
+        </w:rPr>
+        <w:t>=</w:t>
+      </w:r>
+      <w:r>
+        <w:rPr>
+          <w:rFonts w:ascii="Droid Sans Mono;monospace" w:hAnsi="Droid Sans Mono;monospace"/>
+          <w:b w:val="false"/>
+          <w:color w:val="A89984"/>
+          <w:sz w:val="21"/>
+          <w:shd w:fill="282828" w:val="clear"/>
+        </w:rPr>
+        <w:t>'</w:t>
+      </w:r>
+      <w:r>
+        <w:rPr>
+          <w:rFonts w:ascii="Droid Sans Mono;monospace" w:hAnsi="Droid Sans Mono;monospace"/>
+          <w:b w:val="false"/>
+          <w:color w:val="B8BB26"/>
+          <w:sz w:val="21"/>
+          <w:shd w:fill="282828" w:val="clear"/>
+        </w:rPr>
+        <w:t>haha</w:t>
+      </w:r>
+      <w:r>
+        <w:rPr>
+          <w:rFonts w:ascii="Droid Sans Mono;monospace" w:hAnsi="Droid Sans Mono;monospace"/>
+          <w:b w:val="false"/>
+          <w:color w:val="A89984"/>
+          <w:sz w:val="21"/>
+          <w:shd w:fill="282828" w:val="clear"/>
+        </w:rPr>
+        <w:t>'</w:t>
+      </w:r>
+      <w:r>
+        <w:rPr>
+          <w:rFonts w:ascii="Droid Sans Mono;monospace" w:hAnsi="Droid Sans Mono;monospace"/>
+          <w:b w:val="false"/>
+          <w:color w:val="EBDBB2"/>
+          <w:sz w:val="21"/>
+          <w:shd w:fill="282828" w:val="clear"/>
+        </w:rPr>
+        <w:t>;</w:t>
+      </w:r>
+    </w:p>
+    <w:p>
+      <w:pPr>
+        <w:pStyle w:val="NormalWeb"/>
+        <w:spacing w:before="280" w:after="280"/>
+        <w:rPr>
+          <w:rFonts w:ascii="Times New Roman" w:hAnsi="Times New Roman"/>
+          <w:color w:val="000000"/>
+        </w:rPr>
+      </w:pPr>
+      <w:r>
+        <w:rPr>
+          <w:color w:val="000000"/>
+        </w:rPr>
+        <w:t>и получить результат:</w:t>
+      </w:r>
+    </w:p>
+    <w:p>
+      <w:pPr>
+        <w:pStyle w:val="Heading1"/>
+        <w:ind w:hanging="0" w:start="0"/>
+        <w:rPr/>
+      </w:pPr>
+      <w:r>
+        <w:rPr/>
+        <w:t>Result Set Batch 2 - Query 1</w:t>
+      </w:r>
+    </w:p>
+    <w:p>
+      <w:pPr>
+        <w:pStyle w:val="BodyText"/>
+        <w:rPr/>
+      </w:pPr>
+      <w:r>
+        <w:rPr/>
+        <w:t>object_id   name        index_id    type        type_desc     is_unique   data_space_id  ignore_dup_key  is_primary_key  is_unique_constraint  fill_factor  is_padded   is_disabled  is_hypothetical  is_ignored_in_optimization  allow_row_locks  allow_page_locks  has_filter  filter_definition  compression_delay  suppress_dup_key_messages  auto_created  optimize_for_sequential_key</w:t>
+      </w:r>
+    </w:p>
+    <w:p>
+      <w:pPr>
+        <w:pStyle w:val="HorizontalLine"/>
+        <w:rPr/>
+      </w:pPr>
+      <w:r>
+        <w:rPr/>
+      </w:r>
+    </w:p>
+    <w:p>
+      <w:pPr>
+        <w:pStyle w:val="BodyText"/>
+        <w:rPr/>
+      </w:pPr>
+      <w:r>
+        <w:rPr/>
+        <w:t>1221579390  haha        2           2           NONCLUSTERED  0           1              0               0               0                     0            0           0            0                0                           1                1                 0           NULL               NULL               0                          0             0</w:t>
+        <w:br/>
+        <w:t>(1 row affected)</w:t>
+      </w:r>
+    </w:p>
+    <w:p>
+      <w:pPr>
+        <w:pStyle w:val="BodyText"/>
+        <w:spacing w:before="0" w:after="140"/>
+        <w:rPr/>
+      </w:pPr>
+      <w:r>
+        <w:rPr/>
       </w:r>
     </w:p>
     <w:sectPr>
@@ -4519,9 +4809,10 @@
   <w:abstractNum w:abstractNumId="1">
     <w:lvl w:ilvl="0">
       <w:start w:val="1"/>
-      <w:numFmt w:val="decimal"/>
+      <w:numFmt w:val="none"/>
+      <w:pStyle w:val="Heading1"/>
       <w:suff w:val="nothing"/>
-      <w:lvlText w:val="%1."/>
+      <w:lvlText w:val=""/>
       <w:lvlJc w:val="start"/>
       <w:pPr>
         <w:tabs>
@@ -4529,111 +4820,110 @@
         </w:tabs>
         <w:ind w:start="0" w:hanging="0"/>
       </w:pPr>
-      <w:rPr/>
     </w:lvl>
     <w:lvl w:ilvl="1">
       <w:start w:val="1"/>
-      <w:numFmt w:val="decimal"/>
-      <w:lvlText w:val="%2."/>
+      <w:numFmt w:val="none"/>
+      <w:suff w:val="nothing"/>
+      <w:lvlText w:val=""/>
       <w:lvlJc w:val="start"/>
       <w:pPr>
         <w:tabs>
-          <w:tab w:val="num" w:pos="1418"/>
+          <w:tab w:val="num" w:pos="0"/>
         </w:tabs>
-        <w:ind w:start="1418" w:hanging="283"/>
-      </w:pPr>
-      <w:rPr/>
+        <w:ind w:start="0" w:hanging="0"/>
+      </w:pPr>
     </w:lvl>
     <w:lvl w:ilvl="2">
       <w:start w:val="1"/>
-      <w:numFmt w:val="decimal"/>
-      <w:lvlText w:val="%3."/>
+      <w:numFmt w:val="none"/>
+      <w:suff w:val="nothing"/>
+      <w:lvlText w:val=""/>
       <w:lvlJc w:val="start"/>
       <w:pPr>
         <w:tabs>
-          <w:tab w:val="num" w:pos="2127"/>
+          <w:tab w:val="num" w:pos="0"/>
         </w:tabs>
-        <w:ind w:start="2127" w:hanging="283"/>
-      </w:pPr>
-      <w:rPr/>
+        <w:ind w:start="0" w:hanging="0"/>
+      </w:pPr>
     </w:lvl>
     <w:lvl w:ilvl="3">
       <w:start w:val="1"/>
-      <w:numFmt w:val="decimal"/>
-      <w:lvlText w:val="%4."/>
+      <w:numFmt w:val="none"/>
+      <w:suff w:val="nothing"/>
+      <w:lvlText w:val=""/>
       <w:lvlJc w:val="start"/>
       <w:pPr>
         <w:tabs>
-          <w:tab w:val="num" w:pos="2836"/>
+          <w:tab w:val="num" w:pos="0"/>
         </w:tabs>
-        <w:ind w:start="2836" w:hanging="283"/>
-      </w:pPr>
-      <w:rPr/>
+        <w:ind w:start="0" w:hanging="0"/>
+      </w:pPr>
     </w:lvl>
     <w:lvl w:ilvl="4">
       <w:start w:val="1"/>
-      <w:numFmt w:val="decimal"/>
-      <w:lvlText w:val="%5."/>
+      <w:numFmt w:val="none"/>
+      <w:suff w:val="nothing"/>
+      <w:lvlText w:val=""/>
       <w:lvlJc w:val="start"/>
       <w:pPr>
         <w:tabs>
-          <w:tab w:val="num" w:pos="3545"/>
+          <w:tab w:val="num" w:pos="0"/>
         </w:tabs>
-        <w:ind w:start="3545" w:hanging="283"/>
-      </w:pPr>
-      <w:rPr/>
+        <w:ind w:start="0" w:hanging="0"/>
+      </w:pPr>
     </w:lvl>
     <w:lvl w:ilvl="5">
       <w:start w:val="1"/>
-      <w:numFmt w:val="decimal"/>
-      <w:lvlText w:val="%6."/>
+      <w:numFmt w:val="none"/>
+      <w:suff w:val="nothing"/>
+      <w:lvlText w:val=""/>
       <w:lvlJc w:val="start"/>
       <w:pPr>
         <w:tabs>
-          <w:tab w:val="num" w:pos="4254"/>
+          <w:tab w:val="num" w:pos="0"/>
         </w:tabs>
-        <w:ind w:start="4254" w:hanging="283"/>
-      </w:pPr>
-      <w:rPr/>
+        <w:ind w:start="0" w:hanging="0"/>
+      </w:pPr>
     </w:lvl>
     <w:lvl w:ilvl="6">
       <w:start w:val="1"/>
-      <w:numFmt w:val="decimal"/>
-      <w:lvlText w:val="%7."/>
+      <w:numFmt w:val="none"/>
+      <w:suff w:val="nothing"/>
+      <w:lvlText w:val=""/>
       <w:lvlJc w:val="start"/>
       <w:pPr>
         <w:tabs>
-          <w:tab w:val="num" w:pos="4963"/>
+          <w:tab w:val="num" w:pos="0"/>
         </w:tabs>
-        <w:ind w:start="4963" w:hanging="283"/>
-      </w:pPr>
-      <w:rPr/>
+        <w:ind w:start="0" w:hanging="0"/>
+      </w:pPr>
     </w:lvl>
     <w:lvl w:ilvl="7">
       <w:start w:val="1"/>
-      <w:numFmt w:val="decimal"/>
-      <w:lvlText w:val="%8."/>
+      <w:numFmt w:val="none"/>
+      <w:suff w:val="nothing"/>
+      <w:lvlText w:val=""/>
       <w:lvlJc w:val="start"/>
       <w:pPr>
         <w:tabs>
-          <w:tab w:val="num" w:pos="5672"/>
+          <w:tab w:val="num" w:pos="0"/>
         </w:tabs>
-        <w:ind w:start="5672" w:hanging="283"/>
-      </w:pPr>
-      <w:rPr/>
+        <w:ind w:start="0" w:hanging="0"/>
+      </w:pPr>
     </w:lvl>
     <w:lvl w:ilvl="8">
       <w:start w:val="1"/>
-      <w:numFmt w:val="decimal"/>
-      <w:lvlText w:val="%9."/>
+      <w:numFmt w:val="none"/>
+      <w:suff w:val="nothing"/>
+      <w:lvlText w:val=""/>
       <w:lvlJc w:val="start"/>
       <w:pPr>
         <w:tabs>
-          <w:tab w:val="num" w:pos="6381"/>
+          <w:tab w:val="num" w:pos="0"/>
         </w:tabs>
-        <w:ind w:start="6381" w:hanging="283"/>
-      </w:pPr>
-      <w:rPr/>
+        <w:ind w:start="0" w:hanging="0"/>
+      </w:pPr>
     </w:lvl>
   </w:abstractNum>
   <w:abstractNum w:abstractNumId="2">
@@ -4999,9 +5289,9 @@
   <w:abstractNum w:abstractNumId="5">
     <w:lvl w:ilvl="0">
       <w:start w:val="1"/>
-      <w:numFmt w:val="none"/>
+      <w:numFmt w:val="decimal"/>
       <w:suff w:val="nothing"/>
-      <w:lvlText w:val=""/>
+      <w:lvlText w:val="%1."/>
       <w:lvlJc w:val="start"/>
       <w:pPr>
         <w:tabs>
@@ -5009,110 +5299,111 @@
         </w:tabs>
         <w:ind w:start="0" w:hanging="0"/>
       </w:pPr>
+      <w:rPr/>
     </w:lvl>
     <w:lvl w:ilvl="1">
       <w:start w:val="1"/>
-      <w:numFmt w:val="none"/>
-      <w:suff w:val="nothing"/>
-      <w:lvlText w:val=""/>
+      <w:numFmt w:val="decimal"/>
+      <w:lvlText w:val="%2."/>
       <w:lvlJc w:val="start"/>
       <w:pPr>
         <w:tabs>
-          <w:tab w:val="num" w:pos="0"/>
+          <w:tab w:val="num" w:pos="1418"/>
         </w:tabs>
-        <w:ind w:start="0" w:hanging="0"/>
-      </w:pPr>
+        <w:ind w:start="1418" w:hanging="283"/>
+      </w:pPr>
+      <w:rPr/>
     </w:lvl>
     <w:lvl w:ilvl="2">
       <w:start w:val="1"/>
-      <w:numFmt w:val="none"/>
-      <w:suff w:val="nothing"/>
-      <w:lvlText w:val=""/>
+      <w:numFmt w:val="decimal"/>
+      <w:lvlText w:val="%3."/>
       <w:lvlJc w:val="start"/>
       <w:pPr>
         <w:tabs>
-          <w:tab w:val="num" w:pos="0"/>
+          <w:tab w:val="num" w:pos="2127"/>
         </w:tabs>
-        <w:ind w:start="0" w:hanging="0"/>
-      </w:pPr>
+        <w:ind w:start="2127" w:hanging="283"/>
+      </w:pPr>
+      <w:rPr/>
     </w:lvl>
     <w:lvl w:ilvl="3">
       <w:start w:val="1"/>
-      <w:numFmt w:val="none"/>
-      <w:suff w:val="nothing"/>
-      <w:lvlText w:val=""/>
+      <w:numFmt w:val="decimal"/>
+      <w:lvlText w:val="%4."/>
       <w:lvlJc w:val="start"/>
       <w:pPr>
         <w:tabs>
-          <w:tab w:val="num" w:pos="0"/>
+          <w:tab w:val="num" w:pos="2836"/>
         </w:tabs>
-        <w:ind w:start="0" w:hanging="0"/>
-      </w:pPr>
+        <w:ind w:start="2836" w:hanging="283"/>
+      </w:pPr>
+      <w:rPr/>
     </w:lvl>
     <w:lvl w:ilvl="4">
       <w:start w:val="1"/>
-      <w:numFmt w:val="none"/>
-      <w:suff w:val="nothing"/>
-      <w:lvlText w:val=""/>
+      <w:numFmt w:val="decimal"/>
+      <w:lvlText w:val="%5."/>
       <w:lvlJc w:val="start"/>
       <w:pPr>
         <w:tabs>
-          <w:tab w:val="num" w:pos="0"/>
+          <w:tab w:val="num" w:pos="3545"/>
         </w:tabs>
-        <w:ind w:start="0" w:hanging="0"/>
-      </w:pPr>
+        <w:ind w:start="3545" w:hanging="283"/>
+      </w:pPr>
+      <w:rPr/>
     </w:lvl>
     <w:lvl w:ilvl="5">
       <w:start w:val="1"/>
-      <w:numFmt w:val="none"/>
-      <w:suff w:val="nothing"/>
-      <w:lvlText w:val=""/>
+      <w:numFmt w:val="decimal"/>
+      <w:lvlText w:val="%6."/>
       <w:lvlJc w:val="start"/>
       <w:pPr>
         <w:tabs>
-          <w:tab w:val="num" w:pos="0"/>
+          <w:tab w:val="num" w:pos="4254"/>
         </w:tabs>
-        <w:ind w:start="0" w:hanging="0"/>
-      </w:pPr>
+        <w:ind w:start="4254" w:hanging="283"/>
+      </w:pPr>
+      <w:rPr/>
     </w:lvl>
     <w:lvl w:ilvl="6">
       <w:start w:val="1"/>
-      <w:numFmt w:val="none"/>
-      <w:suff w:val="nothing"/>
-      <w:lvlText w:val=""/>
+      <w:numFmt w:val="decimal"/>
+      <w:lvlText w:val="%7."/>
       <w:lvlJc w:val="start"/>
       <w:pPr>
         <w:tabs>
-          <w:tab w:val="num" w:pos="0"/>
+          <w:tab w:val="num" w:pos="4963"/>
         </w:tabs>
-        <w:ind w:start="0" w:hanging="0"/>
-      </w:pPr>
+        <w:ind w:start="4963" w:hanging="283"/>
+      </w:pPr>
+      <w:rPr/>
     </w:lvl>
     <w:lvl w:ilvl="7">
       <w:start w:val="1"/>
-      <w:numFmt w:val="none"/>
-      <w:suff w:val="nothing"/>
-      <w:lvlText w:val=""/>
+      <w:numFmt w:val="decimal"/>
+      <w:lvlText w:val="%8."/>
       <w:lvlJc w:val="start"/>
       <w:pPr>
         <w:tabs>
-          <w:tab w:val="num" w:pos="0"/>
+          <w:tab w:val="num" w:pos="5672"/>
         </w:tabs>
-        <w:ind w:start="0" w:hanging="0"/>
-      </w:pPr>
+        <w:ind w:start="5672" w:hanging="283"/>
+      </w:pPr>
+      <w:rPr/>
     </w:lvl>
     <w:lvl w:ilvl="8">
       <w:start w:val="1"/>
-      <w:numFmt w:val="none"/>
-      <w:suff w:val="nothing"/>
-      <w:lvlText w:val=""/>
+      <w:numFmt w:val="decimal"/>
+      <w:lvlText w:val="%9."/>
       <w:lvlJc w:val="start"/>
       <w:pPr>
         <w:tabs>
-          <w:tab w:val="num" w:pos="0"/>
+          <w:tab w:val="num" w:pos="6381"/>
         </w:tabs>
-        <w:ind w:start="0" w:hanging="0"/>
-      </w:pPr>
+        <w:ind w:start="6381" w:hanging="283"/>
+      </w:pPr>
+      <w:rPr/>
     </w:lvl>
   </w:abstractNum>
   <w:num w:numId="1">
@@ -5534,6 +5825,7 @@
     <w:rsid w:val="005253c6"/>
     <w:pPr>
       <w:widowControl/>
+      <w:suppressAutoHyphens w:val="true"/>
       <w:bidi w:val="0"/>
       <w:spacing w:lineRule="auto" w:line="259" w:before="0" w:after="160"/>
       <w:jc w:val="start"/>
@@ -5545,6 +5837,26 @@
       <w:sz w:val="22"/>
       <w:szCs w:val="22"/>
       <w:lang w:val="ru-BY" w:eastAsia="en-US" w:bidi="ar-SA"/>
+    </w:rPr>
+  </w:style>
+  <w:style w:type="paragraph" w:styleId="Heading1">
+    <w:name w:val="heading 1"/>
+    <w:basedOn w:val="Heading"/>
+    <w:next w:val="BodyText"/>
+    <w:qFormat/>
+    <w:pPr>
+      <w:numPr>
+        <w:ilvl w:val="0"/>
+        <w:numId w:val="1"/>
+      </w:numPr>
+      <w:spacing w:before="240" w:after="120"/>
+      <w:outlineLvl w:val="0"/>
+    </w:pPr>
+    <w:rPr>
+      <w:b/>
+      <w:bCs/>
+      <w:sz w:val="36"/>
+      <w:szCs w:val="36"/>
     </w:rPr>
   </w:style>
   <w:style w:type="paragraph" w:styleId="Heading3">
@@ -5739,6 +6051,23 @@
       <w:sz w:val="24"/>
       <w:szCs w:val="24"/>
       <w:lang w:eastAsia="ru-BY"/>
+    </w:rPr>
+  </w:style>
+  <w:style w:type="paragraph" w:styleId="HorizontalLine">
+    <w:name w:val="Horizontal Line"/>
+    <w:basedOn w:val="Normal"/>
+    <w:next w:val="BodyText"/>
+    <w:qFormat/>
+    <w:pPr>
+      <w:suppressLineNumbers/>
+      <w:pBdr>
+        <w:bottom w:val="double" w:sz="2" w:space="0" w:color="808080"/>
+      </w:pBdr>
+      <w:spacing w:before="0" w:after="283"/>
+    </w:pPr>
+    <w:rPr>
+      <w:sz w:val="12"/>
+      <w:szCs w:val="12"/>
     </w:rPr>
   </w:style>
   <w:style w:type="numbering" w:styleId="NoList" w:default="1">

</xml_diff>